<commit_message>
Tambah DIVEZY ke CV, perbaiki tahun dan link Figma
Co-Authored-By: Claude Opus 5.5 <noreply@anthropic.com>
</commit_message>
<xml_diff>
--- a/cv/CV_Steven_Huang_ATS.docx
+++ b/cv/CV_Steven_Huang_ATS.docx
@@ -316,6 +316,80 @@
           <w:sz w:val="20"/>
         </w:rPr>
         <w:t>Teknologi: Laravel (PHP), PostgreSQL, React, TypeScript, Tailwind CSS, React Native (Expo), AWS EC2, Cloudflare R2.</w:t>
+      </w:r>
+    </w:p>
+    <w:p>
+      <w:pPr>
+        <w:tabs>
+          <w:tab w:pos="10205" w:val="right"/>
+        </w:tabs>
+        <w:spacing w:after="0" w:before="0" w:line="259" w:lineRule="auto"/>
+      </w:pPr>
+      <w:r>
+        <w:rPr>
+          <w:rFonts w:ascii="Arial" w:hAnsi="Arial"/>
+          <w:b/>
+          <w:i w:val="0"/>
+          <w:sz w:val="20"/>
+        </w:rPr>
+        <w:t>DIVEZY – Desain UI/UX Aplikasi Sewa Alat Diving</w:t>
+      </w:r>
+      <w:r>
+        <w:rPr>
+          <w:rFonts w:ascii="Arial" w:hAnsi="Arial"/>
+          <w:b w:val="0"/>
+          <w:i w:val="0"/>
+          <w:sz w:val="20"/>
+        </w:rPr>
+        <w:tab/>
+        <w:t>2024</w:t>
+      </w:r>
+    </w:p>
+    <w:p>
+      <w:pPr>
+        <w:tabs>
+          <w:tab w:pos="10205" w:val="right"/>
+        </w:tabs>
+        <w:spacing w:after="0" w:before="0" w:line="259" w:lineRule="auto"/>
+      </w:pPr>
+      <w:r>
+        <w:rPr>
+          <w:rFonts w:ascii="Arial" w:hAnsi="Arial"/>
+          <w:b w:val="0"/>
+          <w:i/>
+          <w:sz w:val="20"/>
+        </w:rPr>
+        <w:t>UI/UX Designer (Tugas Kuliah)</w:t>
+      </w:r>
+    </w:p>
+    <w:p>
+      <w:pPr>
+        <w:pStyle w:val="ListBullet"/>
+        <w:spacing w:after="20" w:line="259" w:lineRule="auto"/>
+      </w:pPr>
+      <w:r>
+        <w:rPr>
+          <w:rFonts w:ascii="Arial" w:hAnsi="Arial"/>
+          <w:b w:val="0"/>
+          <w:i w:val="0"/>
+          <w:sz w:val="20"/>
+        </w:rPr>
+        <w:t>Mendesain 19 layar high-fidelity aplikasi mobile sewa alat diving di Figma, mulai dari onboarding hingga pembayaran dan ulasan.</w:t>
+      </w:r>
+    </w:p>
+    <w:p>
+      <w:pPr>
+        <w:pStyle w:val="ListBullet"/>
+        <w:spacing w:after="20" w:line="259" w:lineRule="auto"/>
+      </w:pPr>
+      <w:r>
+        <w:rPr>
+          <w:rFonts w:ascii="Arial" w:hAnsi="Arial"/>
+          <w:b w:val="0"/>
+          <w:i w:val="0"/>
+          <w:sz w:val="20"/>
+        </w:rPr>
+        <w:t>Merancang alur pengguna, komponen yang dapat digunakan ulang, dan prototype interaktif.</w:t>
       </w:r>
     </w:p>
     <w:p>

</xml_diff>

<commit_message>
Rapikan tools, keahlian administrasi, dan label proyek
Co-Authored-By: Claude Opus 5.5 <noreply@anthropic.com>
</commit_message>
<xml_diff>
--- a/cv/CV_Steven_Huang_ATS.docx
+++ b/cv/CV_Steven_Huang_ATS.docx
@@ -483,21 +483,6 @@
           <w:i w:val="0"/>
           <w:sz w:val="20"/>
         </w:rPr>
-        <w:t>Membuat faktur pajak dan invoice.</w:t>
-      </w:r>
-    </w:p>
-    <w:p>
-      <w:pPr>
-        <w:pStyle w:val="ListBullet"/>
-        <w:spacing w:after="20" w:line="259" w:lineRule="auto"/>
-      </w:pPr>
-      <w:r>
-        <w:rPr>
-          <w:rFonts w:ascii="Arial" w:hAnsi="Arial"/>
-          <w:b w:val="0"/>
-          <w:i w:val="0"/>
-          <w:sz w:val="20"/>
-        </w:rPr>
         <w:t>Menyiapkan dan merapikan dokumen administrasi keuangan menggunakan Microsoft Excel dan Word.</w:t>
       </w:r>
     </w:p>
@@ -572,7 +557,7 @@
           <w:i w:val="0"/>
           <w:sz w:val="20"/>
         </w:rPr>
-        <w:t>Membuat faktur pajak, invoice, dan surat jalan menggunakan Microsoft Excel dan Word.</w:t>
+        <w:t>Menyiapkan dokumen administrasi keuangan menggunakan Microsoft Excel dan Word.</w:t>
       </w:r>
     </w:p>
     <w:p>
@@ -712,7 +697,7 @@
           <w:i w:val="0"/>
           <w:sz w:val="20"/>
         </w:rPr>
-        <w:t xml:space="preserve"> Figma, Microsoft Excel, Microsoft Word, AI-Assisted Development (Claude Code, Cursor)</w:t>
+        <w:t xml:space="preserve"> Figma, Microsoft Excel, Microsoft Word, VS Code, AI Coding Assistant (Claude Code, Codex, Cursor)</w:t>
       </w:r>
     </w:p>
     <w:p>
@@ -729,7 +714,7 @@
           <w:i w:val="0"/>
           <w:sz w:val="20"/>
         </w:rPr>
-        <w:t>Administrasi &amp; Keuangan:</w:t>
+        <w:t>Administrasi:</w:t>
       </w:r>
       <w:r>
         <w:rPr>
@@ -738,7 +723,7 @@
           <w:i w:val="0"/>
           <w:sz w:val="20"/>
         </w:rPr>
-        <w:t xml:space="preserve"> Data Entry, Audit Data, Faktur Pajak, Invoice</w:t>
+        <w:t xml:space="preserve"> Data Entry, Audit Data, Administrasi Keuangan</w:t>
       </w:r>
     </w:p>
     <w:p>

</xml_diff>